<commit_message>
Phase 5C: SMPL model loading completed successfully
</commit_message>
<xml_diff>
--- a/FASTHION.docx
+++ b/FASTHION.docx
@@ -41,279 +41,58 @@
         <w:rPr>
           <w:lang w:val="en-US"/>
         </w:rPr>
-        <w:t xml:space="preserve">I have to make a NN </w:t>
-      </w:r>
-      <w:proofErr w:type="gramStart"/>
-      <w:r>
-        <w:rPr>
-          <w:lang w:val="en-US"/>
-        </w:rPr>
-        <w:t>model .</w:t>
-      </w:r>
-      <w:proofErr w:type="gramEnd"/>
-      <w:r>
-        <w:rPr>
-          <w:lang w:val="en-US"/>
-        </w:rPr>
-        <w:t xml:space="preserve"> that take measurement of a SHIRT /PANT (man</w:t>
-      </w:r>
-      <w:proofErr w:type="gramStart"/>
-      <w:r>
-        <w:rPr>
-          <w:lang w:val="en-US"/>
-        </w:rPr>
-        <w:t>) ,</w:t>
-      </w:r>
-      <w:proofErr w:type="gramEnd"/>
-      <w:r>
-        <w:rPr>
-          <w:lang w:val="en-US"/>
-        </w:rPr>
-        <w:t xml:space="preserve"> and provide option to see what actually looks like our SHIRT /</w:t>
-      </w:r>
-      <w:proofErr w:type="gramStart"/>
-      <w:r>
-        <w:rPr>
-          <w:lang w:val="en-US"/>
-        </w:rPr>
-        <w:t>PANT ,</w:t>
-      </w:r>
-      <w:proofErr w:type="gramEnd"/>
-      <w:r>
-        <w:rPr>
-          <w:lang w:val="en-US"/>
-        </w:rPr>
-        <w:t xml:space="preserve"> in real life after </w:t>
-      </w:r>
-      <w:proofErr w:type="gramStart"/>
-      <w:r>
-        <w:rPr>
-          <w:lang w:val="en-US"/>
-        </w:rPr>
-        <w:t>creating .</w:t>
-      </w:r>
-      <w:proofErr w:type="gramEnd"/>
-      <w:r>
-        <w:rPr>
-          <w:lang w:val="en-US"/>
-        </w:rPr>
-        <w:t xml:space="preserve"> 1. Separate </w:t>
-      </w:r>
-      <w:proofErr w:type="spellStart"/>
-      <w:r>
-        <w:rPr>
-          <w:lang w:val="en-US"/>
-        </w:rPr>
-        <w:t>sart</w:t>
-      </w:r>
-      <w:proofErr w:type="spellEnd"/>
-      <w:r>
-        <w:rPr>
-          <w:lang w:val="en-US"/>
-        </w:rPr>
-        <w:t xml:space="preserve"> </w:t>
-      </w:r>
-    </w:p>
-    <w:p>
-      <w:pPr>
-        <w:rPr>
-          <w:lang w:val="en-US"/>
-        </w:rPr>
-      </w:pPr>
-      <w:r>
-        <w:rPr>
-          <w:lang w:val="en-US"/>
-        </w:rPr>
-        <w:t xml:space="preserve">2. </w:t>
-      </w:r>
-      <w:proofErr w:type="spellStart"/>
-      <w:r>
-        <w:rPr>
-          <w:lang w:val="en-US"/>
-        </w:rPr>
-        <w:t>seprate</w:t>
-      </w:r>
-      <w:proofErr w:type="spellEnd"/>
-      <w:r>
-        <w:rPr>
-          <w:lang w:val="en-US"/>
-        </w:rPr>
-        <w:t xml:space="preserve"> </w:t>
-      </w:r>
-      <w:proofErr w:type="gramStart"/>
-      <w:r>
-        <w:rPr>
-          <w:lang w:val="en-US"/>
-        </w:rPr>
-        <w:t>pant ,</w:t>
-      </w:r>
-      <w:proofErr w:type="gramEnd"/>
-    </w:p>
-    <w:p>
-      <w:pPr>
-        <w:rPr>
-          <w:lang w:val="en-US"/>
-        </w:rPr>
-      </w:pPr>
-      <w:r>
-        <w:rPr>
-          <w:lang w:val="en-US"/>
-        </w:rPr>
-        <w:t xml:space="preserve">3. </w:t>
-      </w:r>
-      <w:proofErr w:type="spellStart"/>
-      <w:proofErr w:type="gramStart"/>
-      <w:r>
-        <w:rPr>
-          <w:lang w:val="en-US"/>
-        </w:rPr>
-        <w:t>combile</w:t>
-      </w:r>
-      <w:proofErr w:type="spellEnd"/>
-      <w:r>
-        <w:rPr>
-          <w:lang w:val="en-US"/>
-        </w:rPr>
-        <w:t xml:space="preserve"> ,</w:t>
-      </w:r>
-      <w:proofErr w:type="gramEnd"/>
-      <w:r>
-        <w:rPr>
-          <w:lang w:val="en-US"/>
-        </w:rPr>
-        <w:t xml:space="preserve"> (pant/shirt), with d3 model with </w:t>
-      </w:r>
-      <w:proofErr w:type="spellStart"/>
-      <w:r>
-        <w:rPr>
-          <w:lang w:val="en-US"/>
-        </w:rPr>
-        <w:t>diffent</w:t>
-      </w:r>
-      <w:proofErr w:type="spellEnd"/>
-      <w:r>
-        <w:rPr>
-          <w:lang w:val="en-US"/>
-        </w:rPr>
-        <w:t xml:space="preserve"> styles of the (shirt/pant). </w:t>
-      </w:r>
-    </w:p>
-    <w:p>
-      <w:pPr>
-        <w:rPr>
-          <w:lang w:val="en-US"/>
-        </w:rPr>
-      </w:pPr>
-    </w:p>
-    <w:p>
-      <w:pPr>
-        <w:rPr>
-          <w:lang w:val="en-US"/>
-        </w:rPr>
-      </w:pPr>
-      <w:r>
-        <w:rPr>
-          <w:lang w:val="en-US"/>
-        </w:rPr>
-        <w:t xml:space="preserve">Prompt </w:t>
-      </w:r>
-      <w:proofErr w:type="gramStart"/>
-      <w:r>
-        <w:rPr>
-          <w:lang w:val="en-US"/>
-        </w:rPr>
-        <w:t>1 :</w:t>
-      </w:r>
-      <w:proofErr w:type="gramEnd"/>
-    </w:p>
-    <w:p>
-      <w:proofErr w:type="spellStart"/>
-      <w:r>
-        <w:t>i</w:t>
-      </w:r>
-      <w:proofErr w:type="spellEnd"/>
-      <w:r>
-        <w:t xml:space="preserve"> want to create </w:t>
-      </w:r>
-      <w:proofErr w:type="spellStart"/>
-      <w:r>
-        <w:t>amodel</w:t>
-      </w:r>
-      <w:proofErr w:type="spellEnd"/>
-      <w:r>
-        <w:t xml:space="preserve"> to predict or show , the 3d model/actual images of the SHIRT /pant after giving all the required parameter during the measuring process of the tailer , 1 , when </w:t>
-      </w:r>
-      <w:proofErr w:type="spellStart"/>
-      <w:r>
-        <w:t>i</w:t>
-      </w:r>
-      <w:proofErr w:type="spellEnd"/>
-      <w:r>
-        <w:t xml:space="preserve"> am click on try shirt , how look like </w:t>
-      </w:r>
-      <w:proofErr w:type="spellStart"/>
-      <w:r>
-        <w:t>aftere</w:t>
-      </w:r>
-      <w:proofErr w:type="spellEnd"/>
-      <w:r>
-        <w:t xml:space="preserve"> creating after </w:t>
-      </w:r>
-      <w:proofErr w:type="spellStart"/>
-      <w:r>
-        <w:t>takesing</w:t>
-      </w:r>
-      <w:proofErr w:type="spellEnd"/>
-      <w:r>
-        <w:t xml:space="preserve"> the all measurements , 2, try pant , 3 , try both ()in 3d model and </w:t>
-      </w:r>
-      <w:proofErr w:type="spellStart"/>
-      <w:r>
-        <w:t>diffent</w:t>
-      </w:r>
-      <w:proofErr w:type="spellEnd"/>
-      <w:r>
-        <w:t xml:space="preserve"> </w:t>
-      </w:r>
-      <w:proofErr w:type="spellStart"/>
-      <w:r>
-        <w:t>ype</w:t>
-      </w:r>
-      <w:proofErr w:type="spellEnd"/>
-      <w:r>
-        <w:t xml:space="preserve"> s, different style , option , means , when user go for try it , provide (what type actually you want to show /try ), </w:t>
-      </w:r>
-      <w:proofErr w:type="spellStart"/>
-      <w:r>
-        <w:t>i</w:t>
-      </w:r>
-      <w:proofErr w:type="spellEnd"/>
-      <w:r>
-        <w:t xml:space="preserve"> am also working on AI/ML libraries as </w:t>
-      </w:r>
-      <w:proofErr w:type="spellStart"/>
-      <w:r>
-        <w:t>ou</w:t>
-      </w:r>
-      <w:proofErr w:type="spellEnd"/>
-      <w:r>
-        <w:t xml:space="preserve"> know to train the model so give me how actually </w:t>
-      </w:r>
-      <w:proofErr w:type="spellStart"/>
-      <w:r>
-        <w:t>i</w:t>
-      </w:r>
-      <w:proofErr w:type="spellEnd"/>
-      <w:r>
-        <w:t xml:space="preserve"> am </w:t>
-      </w:r>
-      <w:proofErr w:type="spellStart"/>
-      <w:r>
-        <w:t>dvelope</w:t>
-      </w:r>
-      <w:proofErr w:type="spellEnd"/>
-      <w:r>
-        <w:t xml:space="preserve"> the model</w:t>
+        <w:t xml:space="preserve">I have to make a NN model . that take measurement of a SHIRT /PANT (man) , and provide option to see what actually looks like our SHIRT /PANT , in real life after creating . 1. Separate sart </w:t>
+      </w:r>
+    </w:p>
+    <w:p>
+      <w:pPr>
+        <w:rPr>
+          <w:lang w:val="en-US"/>
+        </w:rPr>
+      </w:pPr>
+      <w:r>
+        <w:rPr>
+          <w:lang w:val="en-US"/>
+        </w:rPr>
+        <w:t>2. seprate pant ,</w:t>
+      </w:r>
+    </w:p>
+    <w:p>
+      <w:pPr>
+        <w:rPr>
+          <w:lang w:val="en-US"/>
+        </w:rPr>
+      </w:pPr>
+      <w:r>
+        <w:rPr>
+          <w:lang w:val="en-US"/>
+        </w:rPr>
+        <w:t xml:space="preserve">3. combile , (pant/shirt), with d3 model with diffent styles of the (shirt/pant). </w:t>
+      </w:r>
+    </w:p>
+    <w:p>
+      <w:pPr>
+        <w:rPr>
+          <w:lang w:val="en-US"/>
+        </w:rPr>
+      </w:pPr>
+    </w:p>
+    <w:p>
+      <w:pPr>
+        <w:rPr>
+          <w:lang w:val="en-US"/>
+        </w:rPr>
+      </w:pPr>
+      <w:r>
+        <w:rPr>
+          <w:lang w:val="en-US"/>
+        </w:rPr>
+        <w:t>Prompt 1 :</w:t>
+      </w:r>
+    </w:p>
+    <w:p>
+      <w:r>
+        <w:t>i want to create amodel to predict or show , the 3d model/actual images of the SHIRT /pant after giving all the required parameter during the measuring process of the tailer , 1 , when i am click on try shirt , how look like aftere creating after takesing the all measurements , 2, try pant , 3 , try both ()in 3d model and diffent ype s, different style , option , means , when user go for try it , provide (what type actually you want to show /try ), i am also working on AI/ML libraries as ou know to train the model so give me how actually i am dvelope the model</w:t>
       </w:r>
     </w:p>
     <w:p/>
@@ -888,13 +667,8 @@
           <w:numId w:val="4"/>
         </w:numPr>
       </w:pPr>
-      <w:proofErr w:type="spellStart"/>
-      <w:r>
-        <w:t>Color</w:t>
-      </w:r>
-      <w:proofErr w:type="spellEnd"/>
-      <w:r>
-        <w:t xml:space="preserve"> </w:t>
+      <w:r>
+        <w:t xml:space="preserve">Color </w:t>
       </w:r>
     </w:p>
     <w:p>
@@ -1417,11 +1191,9 @@
             <w:hideMark/>
           </w:tcPr>
           <w:p>
-            <w:proofErr w:type="spellStart"/>
             <w:r>
               <w:t>PyTorch</w:t>
             </w:r>
-            <w:proofErr w:type="spellEnd"/>
           </w:p>
         </w:tc>
         <w:tc>
@@ -1519,13 +1291,8 @@
           </w:tcPr>
           <w:p>
             <w:r>
-              <w:t xml:space="preserve">3D </w:t>
+              <w:t>3D Modeling</w:t>
             </w:r>
-            <w:proofErr w:type="spellStart"/>
-            <w:r>
-              <w:t>Modeling</w:t>
-            </w:r>
-            <w:proofErr w:type="spellEnd"/>
           </w:p>
         </w:tc>
       </w:tr>
@@ -1627,11 +1394,9 @@
             <w:hideMark/>
           </w:tcPr>
           <w:p>
-            <w:proofErr w:type="spellStart"/>
             <w:r>
               <w:t>FastAPI</w:t>
             </w:r>
-            <w:proofErr w:type="spellEnd"/>
           </w:p>
         </w:tc>
         <w:tc>
@@ -1733,16 +1498,11 @@
         </w:numPr>
       </w:pPr>
       <w:r>
-        <w:t xml:space="preserve">CAESAR </w:t>
-      </w:r>
-      <w:proofErr w:type="gramStart"/>
-      <w:r>
-        <w:t xml:space="preserve">Dataset </w:t>
+        <w:t xml:space="preserve">CAESAR Dataset </w:t>
       </w:r>
       <w:r>
         <w:t xml:space="preserve"> (</w:t>
       </w:r>
-      <w:proofErr w:type="gramEnd"/>
       <w:r>
         <w:t>Civilian American and European Surface Anthropometry Resource</w:t>
       </w:r>
@@ -2135,15 +1895,7 @@
       </w:r>
       <w:r>
         <w:br/>
-        <w:t xml:space="preserve">    </w:t>
-      </w:r>
-      <w:proofErr w:type="spellStart"/>
-      <w:r>
-        <w:t>dress_shirt</w:t>
-      </w:r>
-      <w:proofErr w:type="spellEnd"/>
-      <w:r>
-        <w:t>/</w:t>
+        <w:t xml:space="preserve">    dress_shirt/</w:t>
       </w:r>
       <w:r>
         <w:br/>
@@ -2155,15 +1907,7 @@
       </w:r>
       <w:r>
         <w:br/>
-        <w:t xml:space="preserve">    </w:t>
-      </w:r>
-      <w:proofErr w:type="spellStart"/>
-      <w:r>
-        <w:t>tshirt</w:t>
-      </w:r>
-      <w:proofErr w:type="spellEnd"/>
-      <w:r>
-        <w:t>/</w:t>
+        <w:t xml:space="preserve">    tshirt/</w:t>
       </w:r>
       <w:r>
         <w:br/>
@@ -2211,34 +1955,20 @@
       </w:r>
       <w:r>
         <w:br/>
-      </w:r>
-      <w:proofErr w:type="spellStart"/>
-      <w:r>
         <w:t>shirt.fbx</w:t>
       </w:r>
-      <w:proofErr w:type="spellEnd"/>
-      <w:r>
-        <w:br/>
-      </w:r>
-      <w:proofErr w:type="spellStart"/>
-      <w:r>
+      <w:r>
+        <w:br/>
         <w:t>shirt.glb</w:t>
       </w:r>
-      <w:proofErr w:type="spellEnd"/>
       <w:r>
         <w:br/>
         <w:t>texture.png</w:t>
       </w:r>
       <w:r>
         <w:br/>
-      </w:r>
-      <w:proofErr w:type="spellStart"/>
-      <w:proofErr w:type="gramStart"/>
-      <w:r>
         <w:t>fabric.json</w:t>
       </w:r>
-      <w:proofErr w:type="spellEnd"/>
-      <w:proofErr w:type="gramEnd"/>
     </w:p>
     <w:p>
       <w:r>
@@ -2537,13 +2267,8 @@
       </w:r>
       <w:r>
         <w:br/>
-        <w:t xml:space="preserve">Y = </w:t>
-      </w:r>
-      <w:proofErr w:type="spellStart"/>
-      <w:r>
-        <w:t>smpl_parameters</w:t>
-      </w:r>
-      <w:proofErr w:type="spellEnd"/>
+        <w:t>Y = smpl_parameters</w:t>
+      </w:r>
     </w:p>
     <w:p>
       <w:r>
@@ -2552,109 +2277,34 @@
     </w:p>
     <w:p>
       <w:r>
-        <w:t xml:space="preserve">import </w:t>
-      </w:r>
-      <w:proofErr w:type="spellStart"/>
-      <w:proofErr w:type="gramStart"/>
-      <w:r>
-        <w:t>torch.nn</w:t>
-      </w:r>
-      <w:proofErr w:type="spellEnd"/>
-      <w:proofErr w:type="gramEnd"/>
-      <w:r>
-        <w:t xml:space="preserve"> as </w:t>
-      </w:r>
-      <w:proofErr w:type="spellStart"/>
-      <w:r>
-        <w:t>nn</w:t>
-      </w:r>
-      <w:proofErr w:type="spellEnd"/>
-      <w:r>
-        <w:br/>
-      </w:r>
-      <w:r>
-        <w:br/>
-        <w:t xml:space="preserve">model = </w:t>
-      </w:r>
-      <w:proofErr w:type="spellStart"/>
-      <w:proofErr w:type="gramStart"/>
-      <w:r>
-        <w:t>nn.Sequential</w:t>
-      </w:r>
-      <w:proofErr w:type="spellEnd"/>
-      <w:proofErr w:type="gramEnd"/>
-      <w:r>
-        <w:t>(</w:t>
-      </w:r>
-      <w:r>
-        <w:br/>
-        <w:t xml:space="preserve">    </w:t>
-      </w:r>
-      <w:proofErr w:type="spellStart"/>
-      <w:proofErr w:type="gramStart"/>
-      <w:r>
-        <w:t>nn.Linear</w:t>
-      </w:r>
-      <w:proofErr w:type="spellEnd"/>
-      <w:proofErr w:type="gramEnd"/>
-      <w:r>
-        <w:t>(20,128),</w:t>
-      </w:r>
-      <w:r>
-        <w:br/>
-        <w:t xml:space="preserve">    </w:t>
-      </w:r>
-      <w:proofErr w:type="spellStart"/>
-      <w:proofErr w:type="gramStart"/>
-      <w:r>
-        <w:t>nn.ReLU</w:t>
-      </w:r>
-      <w:proofErr w:type="spellEnd"/>
-      <w:proofErr w:type="gramEnd"/>
-      <w:r>
-        <w:t>(),</w:t>
-      </w:r>
-      <w:r>
-        <w:br/>
-        <w:t xml:space="preserve">    </w:t>
-      </w:r>
-      <w:proofErr w:type="spellStart"/>
-      <w:proofErr w:type="gramStart"/>
-      <w:r>
-        <w:t>nn.Linear</w:t>
-      </w:r>
-      <w:proofErr w:type="spellEnd"/>
-      <w:proofErr w:type="gramEnd"/>
-      <w:r>
-        <w:t>(128,256),</w:t>
-      </w:r>
-      <w:r>
-        <w:br/>
-        <w:t xml:space="preserve">    </w:t>
-      </w:r>
-      <w:proofErr w:type="spellStart"/>
-      <w:proofErr w:type="gramStart"/>
-      <w:r>
-        <w:t>nn.ReLU</w:t>
-      </w:r>
-      <w:proofErr w:type="spellEnd"/>
-      <w:proofErr w:type="gramEnd"/>
-      <w:r>
-        <w:t>(),</w:t>
-      </w:r>
-      <w:r>
-        <w:br/>
-        <w:t xml:space="preserve">    </w:t>
-      </w:r>
-      <w:proofErr w:type="spellStart"/>
-      <w:proofErr w:type="gramStart"/>
-      <w:r>
-        <w:t>nn.Linear</w:t>
-      </w:r>
-      <w:proofErr w:type="spellEnd"/>
-      <w:proofErr w:type="gramEnd"/>
-      <w:r>
-        <w:t>(256,72)</w:t>
+        <w:t>import torch.nn as nn</w:t>
+      </w:r>
+      <w:r>
+        <w:br/>
+      </w:r>
+      <w:r>
+        <w:br/>
+        <w:t>model = nn.Sequential(</w:t>
+      </w:r>
+      <w:r>
+        <w:br/>
+        <w:t xml:space="preserve">    nn.Linear(20,128),</w:t>
+      </w:r>
+      <w:r>
+        <w:br/>
+        <w:t xml:space="preserve">    nn.ReLU(),</w:t>
+      </w:r>
+      <w:r>
+        <w:br/>
+        <w:t xml:space="preserve">    nn.Linear(128,256),</w:t>
+      </w:r>
+      <w:r>
+        <w:br/>
+        <w:t xml:space="preserve">    nn.ReLU(),</w:t>
+      </w:r>
+      <w:r>
+        <w:br/>
+        <w:t xml:space="preserve">    nn.Linear(256,72)</w:t>
       </w:r>
       <w:r>
         <w:br/>
@@ -2754,11 +2404,9 @@
       </w:r>
     </w:p>
     <w:p>
-      <w:proofErr w:type="spellStart"/>
       <w:r>
         <w:t>avatar.glb</w:t>
       </w:r>
-      <w:proofErr w:type="spellEnd"/>
     </w:p>
     <w:p>
       <w:r>
@@ -2801,12 +2449,8 @@
       </w:r>
       <w:r>
         <w:br/>
-      </w:r>
-      <w:proofErr w:type="spellStart"/>
-      <w:r>
         <w:t>Tshirt</w:t>
       </w:r>
-      <w:proofErr w:type="spellEnd"/>
       <w:r>
         <w:br/>
         <w:t>Flannel</w:t>
@@ -3056,13 +2700,8 @@
       </w:r>
       <w:r>
         <w:br/>
-        <w:t xml:space="preserve">Select </w:t>
-      </w:r>
-      <w:proofErr w:type="spellStart"/>
-      <w:r>
-        <w:t>Color</w:t>
-      </w:r>
-      <w:proofErr w:type="spellEnd"/>
+        <w:t>Select Color</w:t>
+      </w:r>
       <w:r>
         <w:br/>
       </w:r>
@@ -3215,13 +2854,8 @@
           <w:numId w:val="8"/>
         </w:numPr>
       </w:pPr>
-      <w:proofErr w:type="spellStart"/>
-      <w:r>
-        <w:t>TailorNet</w:t>
-      </w:r>
-      <w:proofErr w:type="spellEnd"/>
-      <w:r>
-        <w:t xml:space="preserve"> </w:t>
+      <w:r>
+        <w:t xml:space="preserve">TailorNet </w:t>
       </w:r>
     </w:p>
     <w:p>
@@ -3252,11 +2886,9 @@
       </w:r>
     </w:p>
     <w:p>
-      <w:proofErr w:type="spellStart"/>
       <w:r>
         <w:t>PyTorch</w:t>
       </w:r>
-      <w:proofErr w:type="spellEnd"/>
       <w:r>
         <w:br/>
         <w:t>PyTorch3D</w:t>
@@ -3270,12 +2902,8 @@
       </w:r>
       <w:r>
         <w:br/>
-      </w:r>
-      <w:proofErr w:type="spellStart"/>
-      <w:r>
         <w:t>PyMesh</w:t>
       </w:r>
-      <w:proofErr w:type="spellEnd"/>
     </w:p>
     <w:p>
       <w:r>
@@ -3430,13 +3058,8 @@
       </w:r>
       <w:r>
         <w:br/>
-        <w:t xml:space="preserve">    </w:t>
-      </w:r>
-      <w:proofErr w:type="spellStart"/>
-      <w:r>
-        <w:t>color</w:t>
-      </w:r>
-      <w:proofErr w:type="spellEnd"/>
+        <w:t xml:space="preserve">    color</w:t>
+      </w:r>
       <w:r>
         <w:br/>
         <w:t xml:space="preserve">    fabric</w:t>
@@ -3474,43 +3097,16 @@
       </w:r>
     </w:p>
     <w:p>
-      <w:proofErr w:type="spellStart"/>
-      <w:r>
-        <w:t>texture_map</w:t>
-      </w:r>
-      <w:proofErr w:type="spellEnd"/>
-      <w:r>
-        <w:t>()</w:t>
-      </w:r>
-      <w:r>
-        <w:br/>
-      </w:r>
-      <w:proofErr w:type="spellStart"/>
-      <w:r>
-        <w:t>normal_map</w:t>
-      </w:r>
-      <w:proofErr w:type="spellEnd"/>
-      <w:r>
-        <w:t>()</w:t>
-      </w:r>
-      <w:r>
-        <w:br/>
-      </w:r>
-      <w:proofErr w:type="spellStart"/>
-      <w:r>
-        <w:t>roughness_</w:t>
-      </w:r>
-      <w:proofErr w:type="gramStart"/>
-      <w:r>
-        <w:t>map</w:t>
-      </w:r>
-      <w:proofErr w:type="spellEnd"/>
-      <w:r>
-        <w:t>(</w:t>
-      </w:r>
-      <w:proofErr w:type="gramEnd"/>
-      <w:r>
-        <w:t>)</w:t>
+      <w:r>
+        <w:t>texture_map()</w:t>
+      </w:r>
+      <w:r>
+        <w:br/>
+        <w:t>normal_map()</w:t>
+      </w:r>
+      <w:r>
+        <w:br/>
+        <w:t>roughness_map()</w:t>
       </w:r>
     </w:p>
     <w:p>
@@ -3624,19 +3220,13 @@
       </w:r>
     </w:p>
     <w:p>
-      <w:proofErr w:type="spellStart"/>
       <w:r>
         <w:t>RandomForest</w:t>
       </w:r>
-      <w:proofErr w:type="spellEnd"/>
-      <w:r>
-        <w:br/>
-      </w:r>
-      <w:proofErr w:type="spellStart"/>
-      <w:r>
+      <w:r>
+        <w:br/>
         <w:t>XGBoost</w:t>
       </w:r>
-      <w:proofErr w:type="spellEnd"/>
       <w:r>
         <w:br/>
         <w:t>Neural Networks</w:t>
@@ -3778,19 +3368,13 @@
       </w:r>
     </w:p>
     <w:p>
-      <w:proofErr w:type="spellStart"/>
       <w:r>
         <w:t>FastAPI</w:t>
       </w:r>
-      <w:proofErr w:type="spellEnd"/>
-      <w:r>
-        <w:br/>
-      </w:r>
-      <w:proofErr w:type="spellStart"/>
-      <w:r>
+      <w:r>
+        <w:br/>
         <w:t>PyTorch</w:t>
       </w:r>
-      <w:proofErr w:type="spellEnd"/>
     </w:p>
     <w:p>
       <w:r>
@@ -3878,13 +3462,8 @@
         <w:t>✅</w:t>
       </w:r>
       <w:r>
-        <w:t xml:space="preserve"> Suggest </w:t>
-      </w:r>
-      <w:proofErr w:type="spellStart"/>
-      <w:r>
-        <w:t>colors</w:t>
-      </w:r>
-      <w:proofErr w:type="spellEnd"/>
+        <w:t xml:space="preserve"> Suggest colors</w:t>
+      </w:r>
       <w:r>
         <w:br/>
       </w:r>
@@ -4082,15 +3661,7 @@
       </w:r>
       <w:r>
         <w:br/>
-        <w:t xml:space="preserve">Apply </w:t>
-      </w:r>
-      <w:proofErr w:type="spellStart"/>
-      <w:r>
-        <w:t>colors</w:t>
-      </w:r>
-      <w:proofErr w:type="spellEnd"/>
-      <w:r>
-        <w:t xml:space="preserve"> and fabrics</w:t>
+        <w:t>Apply colors and fabrics</w:t>
       </w:r>
       <w:r>
         <w:br/>
@@ -4241,15 +3812,7 @@
           </w:tcPr>
           <w:p>
             <w:r>
-              <w:t xml:space="preserve">Python + </w:t>
-            </w:r>
-            <w:proofErr w:type="spellStart"/>
-            <w:r>
-              <w:t>PyTorch</w:t>
-            </w:r>
-            <w:proofErr w:type="spellEnd"/>
-            <w:r>
-              <w:t xml:space="preserve"> basics</w:t>
+              <w:t>Python + PyTorch basics</w:t>
             </w:r>
           </w:p>
         </w:tc>
@@ -4307,13 +3870,8 @@
           </w:tcPr>
           <w:p>
             <w:r>
-              <w:t xml:space="preserve">SMPL body </w:t>
+              <w:t>SMPL body modeling</w:t>
             </w:r>
-            <w:proofErr w:type="spellStart"/>
-            <w:r>
-              <w:t>modeling</w:t>
-            </w:r>
-            <w:proofErr w:type="spellEnd"/>
           </w:p>
         </w:tc>
         <w:tc>
@@ -4450,6 +4008,497 @@
           <w:lang w:val="en-US"/>
         </w:rPr>
       </w:pPr>
+    </w:p>
+    <w:p>
+      <w:pPr>
+        <w:rPr>
+          <w:lang w:val="en-US"/>
+        </w:rPr>
+      </w:pPr>
+    </w:p>
+    <w:p>
+      <w:pPr>
+        <w:rPr>
+          <w:lang w:val="en-US"/>
+        </w:rPr>
+      </w:pPr>
+    </w:p>
+    <w:p>
+      <w:pPr>
+        <w:rPr>
+          <w:lang w:val="en-US"/>
+        </w:rPr>
+      </w:pPr>
+    </w:p>
+    <w:p>
+      <w:pPr>
+        <w:rPr>
+          <w:lang w:val="en-US"/>
+        </w:rPr>
+      </w:pPr>
+    </w:p>
+    <w:p>
+      <w:pPr>
+        <w:rPr>
+          <w:lang w:val="en-US"/>
+        </w:rPr>
+      </w:pPr>
+    </w:p>
+    <w:p>
+      <w:pPr>
+        <w:rPr>
+          <w:lang w:val="en-US"/>
+        </w:rPr>
+      </w:pPr>
+      <w:r>
+        <w:rPr>
+          <w:lang w:val="en-US"/>
+        </w:rPr>
+        <w:t xml:space="preserve">PHASE 5B: </w:t>
+      </w:r>
+    </w:p>
+    <w:p>
+      <w:pPr>
+        <w:rPr>
+          <w:lang w:val="en-US"/>
+        </w:rPr>
+      </w:pPr>
+    </w:p>
+    <w:p>
+      <w:pPr>
+        <w:rPr>
+          <w:lang w:val="en-US"/>
+        </w:rPr>
+      </w:pPr>
+      <w:r>
+        <w:rPr>
+          <w:lang w:val="en-US"/>
+        </w:rPr>
+        <w:t>TASK : (SETUP AND DOWNLOAD REAL SMPL DATASTE  okk……)</w:t>
+      </w:r>
+    </w:p>
+    <w:p>
+      <w:pPr>
+        <w:spacing w:after="0"/>
+        <w:rPr>
+          <w:lang w:val="en-US"/>
+        </w:rPr>
+      </w:pPr>
+      <w:r>
+        <w:rPr>
+          <w:lang w:val="en-US"/>
+        </w:rPr>
+        <w:t>Phase 5B-1:</w:t>
+      </w:r>
+    </w:p>
+    <w:p>
+      <w:pPr>
+        <w:spacing w:after="0"/>
+        <w:rPr>
+          <w:lang w:val="en-US"/>
+        </w:rPr>
+      </w:pPr>
+      <w:r>
+        <w:rPr>
+          <w:rFonts w:ascii="Segoe UI Symbol" w:hAnsi="Segoe UI Symbol" w:cs="Segoe UI Symbol"/>
+          <w:lang w:val="en-US"/>
+        </w:rPr>
+        <w:t>✓</w:t>
+      </w:r>
+      <w:r>
+        <w:rPr>
+          <w:lang w:val="en-US"/>
+        </w:rPr>
+        <w:t xml:space="preserve"> Real SMPL Dataset Download</w:t>
+      </w:r>
+    </w:p>
+    <w:p>
+      <w:pPr>
+        <w:spacing w:after="0"/>
+        <w:rPr>
+          <w:lang w:val="en-US"/>
+        </w:rPr>
+      </w:pPr>
+    </w:p>
+    <w:p>
+      <w:pPr>
+        <w:spacing w:after="0"/>
+        <w:rPr>
+          <w:lang w:val="en-US"/>
+        </w:rPr>
+      </w:pPr>
+      <w:r>
+        <w:rPr>
+          <w:lang w:val="en-US"/>
+        </w:rPr>
+        <w:t>Phase 5B-2:</w:t>
+      </w:r>
+    </w:p>
+    <w:p>
+      <w:pPr>
+        <w:spacing w:after="0"/>
+        <w:rPr>
+          <w:lang w:val="en-US"/>
+        </w:rPr>
+      </w:pPr>
+      <w:r>
+        <w:rPr>
+          <w:rFonts w:ascii="Segoe UI Symbol" w:hAnsi="Segoe UI Symbol" w:cs="Segoe UI Symbol"/>
+          <w:lang w:val="en-US"/>
+        </w:rPr>
+        <w:t>✓</w:t>
+      </w:r>
+      <w:r>
+        <w:rPr>
+          <w:lang w:val="en-US"/>
+        </w:rPr>
+        <w:t xml:space="preserve"> smpl_dataset_loader.py</w:t>
+      </w:r>
+    </w:p>
+    <w:p>
+      <w:pPr>
+        <w:spacing w:after="0"/>
+        <w:rPr>
+          <w:lang w:val="en-US"/>
+        </w:rPr>
+      </w:pPr>
+    </w:p>
+    <w:p>
+      <w:pPr>
+        <w:spacing w:after="0"/>
+        <w:rPr>
+          <w:lang w:val="en-US"/>
+        </w:rPr>
+      </w:pPr>
+      <w:r>
+        <w:rPr>
+          <w:lang w:val="en-US"/>
+        </w:rPr>
+        <w:t>Phase 5B-3:</w:t>
+      </w:r>
+    </w:p>
+    <w:p>
+      <w:pPr>
+        <w:spacing w:after="0"/>
+        <w:rPr>
+          <w:lang w:val="en-US"/>
+        </w:rPr>
+      </w:pPr>
+      <w:r>
+        <w:rPr>
+          <w:rFonts w:ascii="Segoe UI Symbol" w:hAnsi="Segoe UI Symbol" w:cs="Segoe UI Symbol"/>
+          <w:lang w:val="en-US"/>
+        </w:rPr>
+        <w:t>✓</w:t>
+      </w:r>
+      <w:r>
+        <w:rPr>
+          <w:lang w:val="en-US"/>
+        </w:rPr>
+        <w:t xml:space="preserve"> smpl_converter.py</w:t>
+      </w:r>
+    </w:p>
+    <w:p>
+      <w:pPr>
+        <w:spacing w:after="0"/>
+        <w:rPr>
+          <w:lang w:val="en-US"/>
+        </w:rPr>
+      </w:pPr>
+    </w:p>
+    <w:p>
+      <w:pPr>
+        <w:spacing w:after="0"/>
+        <w:rPr>
+          <w:lang w:val="en-US"/>
+        </w:rPr>
+      </w:pPr>
+      <w:r>
+        <w:rPr>
+          <w:lang w:val="en-US"/>
+        </w:rPr>
+        <w:t>Phase 5B-4:</w:t>
+      </w:r>
+    </w:p>
+    <w:p>
+      <w:pPr>
+        <w:spacing w:after="0"/>
+        <w:rPr>
+          <w:lang w:val="en-US"/>
+        </w:rPr>
+      </w:pPr>
+      <w:r>
+        <w:rPr>
+          <w:rFonts w:ascii="Segoe UI Symbol" w:hAnsi="Segoe UI Symbol" w:cs="Segoe UI Symbol"/>
+          <w:lang w:val="en-US"/>
+        </w:rPr>
+        <w:t>✓</w:t>
+      </w:r>
+      <w:r>
+        <w:rPr>
+          <w:lang w:val="en-US"/>
+        </w:rPr>
+        <w:t xml:space="preserve"> Retrain Neural Network</w:t>
+      </w:r>
+    </w:p>
+    <w:p>
+      <w:pPr>
+        <w:spacing w:after="0"/>
+        <w:rPr>
+          <w:lang w:val="en-US"/>
+        </w:rPr>
+      </w:pPr>
+    </w:p>
+    <w:p>
+      <w:pPr>
+        <w:spacing w:after="0"/>
+        <w:rPr>
+          <w:lang w:val="en-US"/>
+        </w:rPr>
+      </w:pPr>
+      <w:r>
+        <w:rPr>
+          <w:lang w:val="en-US"/>
+        </w:rPr>
+        <w:lastRenderedPageBreak/>
+        <w:t>Phase 5B-5:</w:t>
+      </w:r>
+    </w:p>
+    <w:p>
+      <w:pPr>
+        <w:spacing w:after="0"/>
+        <w:rPr>
+          <w:lang w:val="en-US"/>
+        </w:rPr>
+      </w:pPr>
+      <w:r>
+        <w:rPr>
+          <w:rFonts w:ascii="Segoe UI Symbol" w:hAnsi="Segoe UI Symbol" w:cs="Segoe UI Symbol"/>
+          <w:lang w:val="en-US"/>
+        </w:rPr>
+        <w:t>✓</w:t>
+      </w:r>
+      <w:r>
+        <w:rPr>
+          <w:lang w:val="en-US"/>
+        </w:rPr>
+        <w:t xml:space="preserve"> smpl_integration.py</w:t>
+      </w:r>
+    </w:p>
+    <w:p>
+      <w:pPr>
+        <w:spacing w:after="0"/>
+        <w:rPr>
+          <w:lang w:val="en-US"/>
+        </w:rPr>
+      </w:pPr>
+    </w:p>
+    <w:p>
+      <w:pPr>
+        <w:spacing w:after="0"/>
+        <w:rPr>
+          <w:lang w:val="en-US"/>
+        </w:rPr>
+      </w:pPr>
+      <w:r>
+        <w:rPr>
+          <w:lang w:val="en-US"/>
+        </w:rPr>
+        <w:t>Phase 5B-6:</w:t>
+      </w:r>
+    </w:p>
+    <w:p>
+      <w:pPr>
+        <w:spacing w:after="0"/>
+        <w:rPr>
+          <w:lang w:val="en-US"/>
+        </w:rPr>
+      </w:pPr>
+      <w:r>
+        <w:rPr>
+          <w:rFonts w:ascii="Segoe UI Symbol" w:hAnsi="Segoe UI Symbol" w:cs="Segoe UI Symbol"/>
+          <w:lang w:val="en-US"/>
+        </w:rPr>
+        <w:t>✓</w:t>
+      </w:r>
+      <w:r>
+        <w:rPr>
+          <w:lang w:val="en-US"/>
+        </w:rPr>
+        <w:t xml:space="preserve"> avatar_generator.py</w:t>
+      </w:r>
+    </w:p>
+    <w:p>
+      <w:pPr>
+        <w:spacing w:after="0"/>
+        <w:rPr>
+          <w:lang w:val="en-US"/>
+        </w:rPr>
+      </w:pPr>
+    </w:p>
+    <w:p>
+      <w:pPr>
+        <w:spacing w:after="0"/>
+        <w:rPr>
+          <w:lang w:val="en-US"/>
+        </w:rPr>
+      </w:pPr>
+      <w:r>
+        <w:rPr>
+          <w:lang w:val="en-US"/>
+        </w:rPr>
+        <w:t>Phase 5B-7:</w:t>
+      </w:r>
+    </w:p>
+    <w:p>
+      <w:pPr>
+        <w:spacing w:after="0"/>
+        <w:rPr>
+          <w:lang w:val="en-US"/>
+        </w:rPr>
+      </w:pPr>
+      <w:r>
+        <w:rPr>
+          <w:rFonts w:ascii="Segoe UI Symbol" w:hAnsi="Segoe UI Symbol" w:cs="Segoe UI Symbol"/>
+          <w:lang w:val="en-US"/>
+        </w:rPr>
+        <w:t>✓</w:t>
+      </w:r>
+      <w:r>
+        <w:rPr>
+          <w:lang w:val="en-US"/>
+        </w:rPr>
+        <w:t xml:space="preserve"> measurement_extractor.py</w:t>
+      </w:r>
+    </w:p>
+    <w:p>
+      <w:pPr>
+        <w:spacing w:after="0"/>
+        <w:rPr>
+          <w:lang w:val="en-US"/>
+        </w:rPr>
+      </w:pPr>
+    </w:p>
+    <w:p>
+      <w:pPr>
+        <w:spacing w:after="0"/>
+        <w:rPr>
+          <w:lang w:val="en-US"/>
+        </w:rPr>
+      </w:pPr>
+      <w:r>
+        <w:rPr>
+          <w:lang w:val="en-US"/>
+        </w:rPr>
+        <w:t>Phase 5B-8:</w:t>
+      </w:r>
+    </w:p>
+    <w:p>
+      <w:pPr>
+        <w:spacing w:after="0"/>
+        <w:rPr>
+          <w:lang w:val="en-US"/>
+        </w:rPr>
+      </w:pPr>
+      <w:r>
+        <w:rPr>
+          <w:rFonts w:ascii="Segoe UI Symbol" w:hAnsi="Segoe UI Symbol" w:cs="Segoe UI Symbol"/>
+          <w:lang w:val="en-US"/>
+        </w:rPr>
+        <w:t>✓</w:t>
+      </w:r>
+      <w:r>
+        <w:rPr>
+          <w:lang w:val="en-US"/>
+        </w:rPr>
+        <w:t xml:space="preserve"> clothing engine</w:t>
+      </w:r>
+    </w:p>
+    <w:p>
+      <w:pPr>
+        <w:spacing w:after="0"/>
+        <w:rPr>
+          <w:lang w:val="en-US"/>
+        </w:rPr>
+      </w:pPr>
+    </w:p>
+    <w:p>
+      <w:pPr>
+        <w:spacing w:after="0"/>
+        <w:rPr>
+          <w:lang w:val="en-US"/>
+        </w:rPr>
+      </w:pPr>
+      <w:r>
+        <w:rPr>
+          <w:lang w:val="en-US"/>
+        </w:rPr>
+        <w:t>Phase 5B-9:</w:t>
+      </w:r>
+    </w:p>
+    <w:p>
+      <w:pPr>
+        <w:spacing w:after="0"/>
+        <w:rPr>
+          <w:lang w:val="en-US"/>
+        </w:rPr>
+      </w:pPr>
+      <w:r>
+        <w:rPr>
+          <w:rFonts w:ascii="Segoe UI Symbol" w:hAnsi="Segoe UI Symbol" w:cs="Segoe UI Symbol"/>
+          <w:lang w:val="en-US"/>
+        </w:rPr>
+        <w:t>✓</w:t>
+      </w:r>
+      <w:r>
+        <w:rPr>
+          <w:lang w:val="en-US"/>
+        </w:rPr>
+        <w:t xml:space="preserve"> Flask APIs</w:t>
+      </w:r>
+    </w:p>
+    <w:p>
+      <w:pPr>
+        <w:spacing w:after="0"/>
+        <w:rPr>
+          <w:lang w:val="en-US"/>
+        </w:rPr>
+      </w:pPr>
+    </w:p>
+    <w:p>
+      <w:pPr>
+        <w:spacing w:after="0"/>
+        <w:rPr>
+          <w:lang w:val="en-US"/>
+        </w:rPr>
+      </w:pPr>
+      <w:r>
+        <w:rPr>
+          <w:lang w:val="en-US"/>
+        </w:rPr>
+        <w:t>Phase 5B-10:</w:t>
+      </w:r>
+    </w:p>
+    <w:p>
+      <w:pPr>
+        <w:spacing w:after="0"/>
+        <w:rPr>
+          <w:lang w:val="en-US"/>
+        </w:rPr>
+      </w:pPr>
+      <w:r>
+        <w:rPr>
+          <w:rFonts w:ascii="Segoe UI Symbol" w:hAnsi="Segoe UI Symbol" w:cs="Segoe UI Symbol"/>
+          <w:lang w:val="en-US"/>
+        </w:rPr>
+        <w:t>✓</w:t>
+      </w:r>
+      <w:r>
+        <w:rPr>
+          <w:lang w:val="en-US"/>
+        </w:rPr>
+        <w:t xml:space="preserve"> Frontend Viewer</w:t>
+      </w:r>
     </w:p>
     <w:sectPr>
       <w:pgSz w:w="11906" w:h="16838"/>
@@ -6747,6 +6796,7 @@
   <w:style w:type="character" w:default="1" w:styleId="DefaultParagraphFont">
     <w:name w:val="Default Paragraph Font"/>
     <w:uiPriority w:val="1"/>
+    <w:semiHidden/>
     <w:unhideWhenUsed/>
   </w:style>
   <w:style w:type="table" w:default="1" w:styleId="TableNormal">

</xml_diff>